<commit_message>
Report: align wording with the engine source; add render-check tooling
- analyse_source signature/return type, CFG001 wording, evidence-path and
  rule-validation descriptions, symbol display example now match the code
- submission/tools/render_check.mjs + measure_pages.py: docx-preview/Chromium
  render to PDF and heading page measurement used to fill the TOC

Co-authored-by: arena-agent <297053741+arena-agent@users.noreply.github.com>
</commit_message>
<xml_diff>
--- a/submission/CodeTrace_BCSE307P_Project_Report.docx
+++ b/submission/CodeTrace_BCSE307P_Project_Report.docx
@@ -6212,7 +6212,7 @@
         <w:jc w:val="both"/>
       </w:pPr>
       <w:r>
-        <w:t xml:space="preserve">The engine first normalises the submitted text and checks it against the input limits. The lexer is a hand-written deterministic scanner over the CT-C token vocabulary: keywords, identifiers, integer, floating-point, character and string literals, operators and punctuation. Every token records its line, column and half-open character range, and these positions are carried through all later phases so that diagnostics, graph nodes and evidence steps can be located precisely. Lexical errors do not stop the scan; the lexer reports a diagnostic and resynchronises, which lets a single run report several unrelated problems. Constructs outside the subset—for instance the </w:t>
+        <w:t xml:space="preserve">The engine first checks the submitted text against the input limits of 512 KiB and 20,000 lines. The lexer is a hand-written deterministic scanner over the CT-C token vocabulary: keywords, identifiers, integer, floating-point, character and string literals, operators and punctuation. Every token records its line, column and half-open character range, and these positions are carried through all later phases so that diagnostics, graph nodes and evidence steps can be located precisely. Lexical errors do not stop the scan; the lexer reports a diagnostic and resynchronises, which lets a single run report several unrelated problems. Constructs outside the subset—for instance the </w:t>
       </w:r>
       <w:r>
         <w:rPr>
@@ -6483,27 +6483,17 @@
         <w:t>Symbol</w:t>
       </w:r>
       <w:r>
-        <w:t xml:space="preserve"> with an integer identity that is unique within the run; later phases refer to symbols by this identity rather than by name, which is what makes shadowed and re-declared variables unambiguous (the identifier </w:t>
+        <w:t xml:space="preserve"> with an integer identity that is unique within the run; later phases refer to symbols by this identity rather than by name, which is what makes shadowed and re-declared variables unambiguous (the interface displays a symbol by identity and name, for example </w:t>
       </w:r>
       <w:r>
         <w:rPr>
           <w:rFonts w:ascii="Consolas" w:hAnsi="Consolas" w:eastAsia="Consolas"/>
           <w:sz w:val="20"/>
         </w:rPr>
-        <w:t>value</w:t>
-      </w:r>
-      <w:r>
-        <w:t xml:space="preserve"> in the examples of Chapter 4 appears as </w:t>
-      </w:r>
-      <w:r>
-        <w:rPr>
-          <w:rFonts w:ascii="Consolas" w:hAnsi="Consolas" w:eastAsia="Consolas"/>
-          <w:sz w:val="20"/>
-        </w:rPr>
-        <w:t>s2:value</w:t>
-      </w:r>
-      <w:r>
-        <w:t xml:space="preserve">). The analyzer reports undeclared identifiers (SEM001), duplicate declarations and redefinitions (SEM002, SEM003), type mismatches in assignments, conditions, calls and returns (SEM004, SEM005, SEM016), </w:t>
+        <w:t>s6:command</w:t>
+      </w:r>
+      <w:r>
+        <w:t xml:space="preserve"> in Figure 4.7). The analyzer reports undeclared identifiers (SEM001), duplicate declarations and redefinitions (SEM002, SEM003), type mismatches in assignments, conditions, calls and returns (SEM004, SEM005, SEM016), </w:t>
       </w:r>
       <w:r>
         <w:rPr>
@@ -6628,7 +6618,7 @@
         <w:t>return</w:t>
       </w:r>
       <w:r>
-        <w:t xml:space="preserve"> produce edges to the loop exit, the loop header and the function exit respectively. Edges are typed with these kinds, which later lets the dependency graph attach control dependences and lets the interface draw each edge kind distinctly. A breadth-first traversal from the entry block computes reachability; statements in unreachable blocks are reported with the CFG001 diagnostic and excluded from the data-flow domains. Figure 4.8 shows the graph of a function with a loop.</w:t>
+        <w:t xml:space="preserve"> produce edges to the loop exit, the loop header and the function exit respectively. Edges are typed with these kinds, which later lets the dependency graph attach control dependences and lets the interface draw each edge kind distinctly. A breadth-first traversal from the entry block computes reachability, and the first statement of every unreachable region is reported with the CFG001 diagnostic. Figure 4.8 shows the graph of a function with a loop.</w:t>
       </w:r>
     </w:p>
     <w:p>
@@ -7251,7 +7241,7 @@
         <w:jc w:val="both"/>
       </w:pPr>
       <w:r>
-        <w:t xml:space="preserve">Security knowledge is expressed in a small declarative rule language rather than in code. A rule file declares a version and any number of sources (functions whose return value or arguments are untrusted, with the contexts they taint), sinks (functions whose argument at a given position must not carry taint of a given context, with a category and a severity), sanitizers (functions that neutralise given contexts), validators (predicates whose true branch is assumed safe) and flows (named pairings of source and sink categories that produce findings). The language has its own grammar of 40 productions; it is parsed by the same LR machinery as CT-C, with a 78-state conflict-free LALR(1) table, and validated for unknown references, duplicate identifiers and inconsistent declarations before use. Rule files are data: they can declare functions, contexts and severities, but they contain no expressions or statements and can never execute anything. The built-in rule set models standard input, integer input, environment variables, command-line arguments and file contents as sources; </w:t>
+        <w:t xml:space="preserve">Security knowledge is expressed in a small declarative rule language rather than in code. A rule file declares a version and any number of sources (functions whose return value or arguments are untrusted, with the contexts they taint), sinks (functions whose argument at a given position must not carry taint of a given context, with a category and a severity), sanitizers (functions that neutralise given contexts), validators (predicates whose true branch is assumed safe) and flows (named pairings of source and sink categories that produce findings). The language has its own grammar of 40 productions; it is parsed by the same LR machinery as CT-C, with a 78-state conflict-free LALR(1) table, and validated before use for duplicate identifiers, unknown contexts and severities, and flows that reference undeclared sources, sinks or sanitizers. Rule files are data: they can declare functions, contexts and severities, but they contain no expressions or statements and can never execute anything. The built-in rule set models standard input, integer input, environment variables, command-line arguments and file contents as sources; </w:t>
       </w:r>
       <w:r>
         <w:rPr>
@@ -7426,7 +7416,7 @@
         <w:t>explain</w:t>
       </w:r>
       <w:r>
-        <w:t xml:space="preserve"> module reconstructs the shortest evidence path from source to sink over the taint edges, classifies the finding and records its remediation. If it does not, the sink call is still recorded, together with the reason—no taint of the required context reached it, the statement lies in a branch whose condition is a literal constant, or the taint was cleared on a guarded edge by a declared validator—so that a user can see what was examined.</w:t>
+        <w:t xml:space="preserve"> module reconstructs the evidence path from source to sink from the recorded taint trace, classifies the finding and records its remediation. If it does not, the sink call is still recorded, together with the reason—no taint of the required context reached it, the statement lies in a branch whose condition is a literal constant, or the taint was cleared on a guarded edge by a declared validator—so that a user can see what was examined.</w:t>
       </w:r>
     </w:p>
     <w:p>
@@ -8155,20 +8145,20 @@
           <w:rFonts w:ascii="Consolas" w:hAnsi="Consolas" w:eastAsia="Consolas"/>
           <w:sz w:val="20"/>
         </w:rPr>
-        <w:t>analyse_source(source, filename, rules, options)</w:t>
-      </w:r>
-      <w:r>
-        <w:t xml:space="preserve">, which returns an </w:t>
+        <w:t>analyse_source(source, filename, rules, parser_mode, run_dependencies, run_slicing, include_builtin_rules)</w:t>
+      </w:r>
+      <w:r>
+        <w:t xml:space="preserve">, which returns a </w:t>
       </w:r>
       <w:r>
         <w:rPr>
           <w:rFonts w:ascii="Consolas" w:hAnsi="Consolas" w:eastAsia="Consolas"/>
           <w:sz w:val="20"/>
         </w:rPr>
-        <w:t>AnalysisResult</w:t>
-      </w:r>
-      <w:r>
-        <w:t xml:space="preserve"> containing the parsed program, the per-function CFGs and data-flow results, the taint facts, the dependency graph, the slice engine, the findings, the diagnostics and the metrics. The function enforces the input limits before lexing, times each stage, and records the partial-analysis reasons. All numbers shown in the interface—token, node, statement, block, edge and definition counts, iteration counts and timings—are measured by the engine for the specific run; none are estimated.</w:t>
+        <w:t>Program</w:t>
+      </w:r>
+      <w:r>
+        <w:t xml:space="preserve"> object containing the parsed program, the per-function CFGs and data-flow results, the taint facts, the dependency graph, the slice engine, the findings, the diagnostics and the metrics. The function enforces the input limits before lexing, times each stage, and records the partial-analysis reasons. All numbers shown in the interface—token, node, statement, block, edge and definition counts, iteration counts and timings—are measured by the engine for the specific run; none are estimated.</w:t>
       </w:r>
     </w:p>
     <w:p>

</xml_diff>